<commit_message>
chore: finalize github readiness and April 8 source-of-truth docs
</commit_message>
<xml_diff>
--- a/PROJECT_HANDOFF_2026-04-08.docx
+++ b/PROJECT_HANDOFF_2026-04-08.docx
@@ -1,22 +1,6 @@
-
-<file path=docProps\app.xml><?xml version="1.0" encoding="utf-8"?>
-<Properties xmlns="http://schemas.openxmlformats.org/officeDocument/2006/extended-properties" xmlns:vt="http://schemas.openxmlformats.org/officeDocument/2006/docPropsVTypes">
-  <Application>Codex</Application>
-</Properties>
-</file>
-
-<file path=docProps\core.xml><?xml version="1.0" encoding="utf-8"?>
-<cp:coreProperties xmlns:cp="http://schemas.openxmlformats.org/package/2006/metadata/core-properties" xmlns:dc="http://purl.org/dc/elements/1.1/" xmlns:dcterms="http://purl.org/dc/terms/" xmlns:dcmitype="http://purl.org/dc/dcmitype/" xmlns:xsi="http://www.w3.org/2001/XMLSchema-instance">
-  <dc:title>Dungeon Dive: Bad Decisions - Project Handoff - April 8 2026</dc:title>
-  <dc:creator>Codex</dc:creator>
-  <cp:lastModifiedBy>Codex</cp:lastModifiedBy>
-  <dcterms:created xsi:type="dcterms:W3CDTF">2026-04-08T13:01:22Z</dcterms:created>
-  <dcterms:modified xsi:type="dcterms:W3CDTF">2026-04-08T13:01:22Z</dcterms:modified>
-</cp:coreProperties>
-</file>
 
 <file path=word\document.xml><?xml version="1.0" encoding="utf-8"?>
-<w:document xmlns:wpc="http://schemas.microsoft.com/office/word/2010/wordprocessingCanvas" xmlns:mc="http://schemas.openxmlformats.org/markup-compatibility/2006" xmlns:o="urn:schemas-microsoft-com:office:office" xmlns:r="http://schemas.openxmlformats.org/officeDocument/2006/relationships" xmlns:m="http://schemas.openxmlformats.org/officeDocument/2006/math" xmlns:v="urn:schemas-microsoft-com:vml" xmlns:wp14="http://schemas.microsoft.com/office/word/2010/wordprocessingDrawing" xmlns:wp="http://schemas.openxmlformats.org/drawingml/2006/wordprocessingDrawing" xmlns:w10="urn:schemas-microsoft-com:office:word" xmlns:w="http://schemas.openxmlformats.org/wordprocessingml/2006/main" xmlns:w14="http://schemas.microsoft.com/office/word/2010/wordml" xmlns:wpg="http://schemas.microsoft.com/office/word/2010/wordprocessingGroup" xmlns:wpi="http://schemas.microsoft.com/office/word/2010/wordprocessingInk" xmlns:wne="http://schemas.microsoft.com/office/2006/wordml" xmlns:wps="http://schemas.microsoft.com/office/word/2010/wordprocessingShape" mc:Ignorable="w14 wp14">
+<w:document xmlns:w="http://schemas.openxmlformats.org/wordprocessingml/2006/main">
   <w:body>
     <w:p>
       <w:r>
@@ -30,7 +14,7 @@
     </w:p>
     <w:p>
       <w:r>
-        <w:t xml:space="preserve">This addendum is the current source of truth after the interactive FTUE, audio-accessibility expansion, input-remapping/controller-readiness pass, dodge-action combat pass, remote-analytics validation scaffold, and documentation alignment sweep.</w:t>
+        <w:t xml:space="preserve">This is the current handoff summary after the interactive FTUE expansion, audio-accessibility expansion, input-remapping/controller-readiness pass, dodge-action combat pass, remote-analytics validation scaffold, readability cleanup, Android tester-build refresh, and documentation alignment sweep.</w:t>
       </w:r>
     </w:p>
     <w:p/>
@@ -47,37 +31,42 @@
     <w:p/>
     <w:p>
       <w:r>
-        <w:t xml:space="preserve">April 8 highlights:</w:t>
+        <w:t xml:space="preserve">Current April 8 highlights:</w:t>
       </w:r>
     </w:p>
     <w:p>
       <w:r>
-        <w:t xml:space="preserve">1. Onboarding is now genuinely interactive instead of briefing-only.</w:t>
+        <w:t xml:space="preserve">1. Onboarding is interactive and replayable instead of briefing-only.</w:t>
       </w:r>
     </w:p>
     <w:p>
       <w:r>
-        <w:t xml:space="preserve">2. Audio settings now persist master, SFX, music, voice, and ambient channels.</w:t>
+        <w:t xml:space="preserve">2. Audio settings persist master, SFX, music, voice, and ambient channels.</w:t>
       </w:r>
     </w:p>
     <w:p>
       <w:r>
-        <w:t xml:space="preserve">3. Battle now supports profile-backed action remapping, dominant-hand bias, and controller-style hint badges.</w:t>
+        <w:t xml:space="preserve">3. Battle supports profile-backed action remapping, dominant-hand bias, controller-style hint badges, and a live dodge action.</w:t>
       </w:r>
     </w:p>
     <w:p>
       <w:r>
-        <w:t xml:space="preserve">4. Combat now includes a real dodge action that adds a tempo/evasion choice.</w:t>
+        <w:t xml:space="preserve">4. The home screen now shows the full title image without forced cropping, and the Android launcher icon now uses the ddbd logo asset.</w:t>
       </w:r>
     </w:p>
     <w:p>
       <w:r>
-        <w:t xml:space="preserve">5. Dev builds now support vendor-neutral remote analytics validation through the Smoke Lab route when explicitly configured.</w:t>
+        <w:t xml:space="preserve">5. First-run helper text now collapses behind toggles after floor 1 of the first-ever dive, and from floor 1 onward on future dives.</w:t>
       </w:r>
     </w:p>
     <w:p>
       <w:r>
-        <w:t xml:space="preserve">6. README, support/privacy docs, and the design-spec audit were aligned to the live product state.</w:t>
+        <w:t xml:space="preserve">6. Battle now scrolls back to the HP / threat read after each action, and archive recap copy now renders on a readable solid card.</w:t>
+      </w:r>
+    </w:p>
+    <w:p>
+      <w:r>
+        <w:t xml:space="preserve">7. Dev builds support vendor-neutral remote analytics validation through the Smoke Lab route when explicitly configured.</w:t>
       </w:r>
     </w:p>
     <w:p/>
@@ -93,6 +82,11 @@
     </w:p>
     <w:p>
       <w:r>
+        <w:t xml:space="preserve">- npm run audit:classes: passed</w:t>
+      </w:r>
+    </w:p>
+    <w:p>
+      <w:r>
         <w:t xml:space="preserve">- npm run lint: passed</w:t>
       </w:r>
     </w:p>
@@ -104,12 +98,22 @@
     <w:p/>
     <w:p>
       <w:r>
-        <w:t xml:space="preserve">Important release note:</w:t>
+        <w:t xml:space="preserve">Current release artifact status:</w:t>
       </w:r>
     </w:p>
     <w:p>
       <w:r>
-        <w:t xml:space="preserve">No new APK was generated in the April 8 repo pass. The most recent tester-build verification remains the April 7 Android release-build pass, so a fresh tester artifact should be rebuilt from current source before another external wave.</w:t>
+        <w:t xml:space="preserve">- Canonical local release output: android/app/build/outputs/apk/release/app-release.apk</w:t>
+      </w:r>
+    </w:p>
+    <w:p>
+      <w:r>
+        <w:t xml:space="preserve">- Current dated outside-tester share copy: release/dungeon-dive-bad-decisions-android-tester-2026-04-08.apk</w:t>
+      </w:r>
+    </w:p>
+    <w:p>
+      <w:r>
+        <w:t xml:space="preserve">- The April 8 tester build has already been sanity-covered on Android through title -&gt; onboarding -&gt; class briefing -&gt; companion select -&gt; run-map -&gt; battle -&gt; reward -&gt; resume -&gt; event -&gt; end-run.</w:t>
       </w:r>
     </w:p>
     <w:p/>
@@ -120,27 +124,32 @@
     </w:p>
     <w:p>
       <w:r>
-        <w:t xml:space="preserve">1. Rebuild a fresh Android tester APK from current source and rerun the Android sanity pass.</w:t>
+        <w:t xml:space="preserve">1. Share the already-built April 8 tester APK for the next outside smoke wave unless source changes again first.</w:t>
       </w:r>
     </w:p>
     <w:p>
       <w:r>
-        <w:t xml:space="preserve">2. Decide whether hardware controller input stays explicitly post-launch.</w:t>
+        <w:t xml:space="preserve">2. If source changes again, rebuild a fresh Android tester APK and rerun the Android sanity pass.</w:t>
       </w:r>
     </w:p>
     <w:p>
       <w:r>
-        <w:t xml:space="preserve">3. Decide whether remote analytics remains dev-only for first release or gets connected to a real production backend.</w:t>
+        <w:t xml:space="preserve">3. Decide whether hardware controller input stays explicitly post-launch.</w:t>
       </w:r>
     </w:p>
     <w:p>
       <w:r>
-        <w:t xml:space="preserve">4. Finalize the public support inbox and any hosted policy/support URLs needed for Play submission.</w:t>
+        <w:t xml:space="preserve">4. Decide whether remote analytics remains dev-only for first release or gets connected to a real production backend.</w:t>
       </w:r>
     </w:p>
     <w:p>
       <w:r>
-        <w:t xml:space="preserve">5. Finalize Google Play listing copy, screenshots, feature graphic, and Data safety answers.</w:t>
+        <w:t xml:space="preserve">5. Finalize the public support inbox and any hosted policy/support URLs needed for Play submission.</w:t>
+      </w:r>
+    </w:p>
+    <w:p>
+      <w:r>
+        <w:t xml:space="preserve">6. Finalize Google Play listing copy, screenshots, feature graphic, and Data safety answers.</w:t>
       </w:r>
     </w:p>
     <w:sectPr>

</xml_diff>